<commit_message>
feat: update enquiry form footer email to finesseoverseaseducation@gmail.com and increase header gap
</commit_message>
<xml_diff>
--- a/Finesse-Enquiry-Form-2026.docx
+++ b/Finesse-Enquiry-Form-2026.docx
@@ -137,7 +137,7 @@
     </w:tbl>
     <w:p>
       <w:pPr>
-        <w:spacing w:before="40" w:after="280"/>
+        <w:spacing w:before="40" w:after="440"/>
         <w:pBdr>
           <w:bottom w:val="single" w:sz="14" w:space="1" w:color="0F766E"/>
         </w:pBdr>
@@ -145,7 +145,7 @@
     </w:p>
     <w:p>
       <w:pPr>
-        <w:spacing w:before="0" w:after="240" w:line="276" w:lineRule="auto"/>
+        <w:spacing w:before="0" w:after="220" w:line="276" w:lineRule="auto"/>
       </w:pPr>
       <w:r>
         <w:rPr>
@@ -167,7 +167,7 @@
     </w:p>
     <w:p>
       <w:pPr>
-        <w:spacing w:before="0" w:after="240" w:line="276" w:lineRule="auto"/>
+        <w:spacing w:before="0" w:after="220" w:line="276" w:lineRule="auto"/>
       </w:pPr>
       <w:r>
         <w:rPr>
@@ -189,7 +189,7 @@
     </w:p>
     <w:p>
       <w:pPr>
-        <w:spacing w:before="0" w:after="240" w:line="276" w:lineRule="auto"/>
+        <w:spacing w:before="0" w:after="220" w:line="276" w:lineRule="auto"/>
       </w:pPr>
       <w:r>
         <w:rPr>
@@ -228,7 +228,7 @@
     </w:p>
     <w:p>
       <w:pPr>
-        <w:spacing w:before="0" w:after="240" w:line="276" w:lineRule="auto"/>
+        <w:spacing w:before="0" w:after="220" w:line="276" w:lineRule="auto"/>
       </w:pPr>
       <w:r>
         <w:rPr>
@@ -267,7 +267,7 @@
     </w:p>
     <w:p>
       <w:pPr>
-        <w:spacing w:before="0" w:after="240" w:line="276" w:lineRule="auto"/>
+        <w:spacing w:before="0" w:after="220" w:line="276" w:lineRule="auto"/>
       </w:pPr>
       <w:r>
         <w:rPr>
@@ -289,7 +289,7 @@
     </w:p>
     <w:p>
       <w:pPr>
-        <w:spacing w:before="0" w:after="240" w:line="276" w:lineRule="auto"/>
+        <w:spacing w:before="0" w:after="220" w:line="276" w:lineRule="auto"/>
       </w:pPr>
       <w:r>
         <w:rPr>
@@ -311,7 +311,7 @@
     </w:p>
     <w:p>
       <w:pPr>
-        <w:spacing w:before="0" w:after="240" w:line="276" w:lineRule="auto"/>
+        <w:spacing w:before="0" w:after="220" w:line="276" w:lineRule="auto"/>
       </w:pPr>
       <w:r>
         <w:rPr>
@@ -333,7 +333,7 @@
     </w:p>
     <w:p>
       <w:pPr>
-        <w:spacing w:before="0" w:after="240" w:line="276" w:lineRule="auto"/>
+        <w:spacing w:before="0" w:after="220" w:line="276" w:lineRule="auto"/>
       </w:pPr>
       <w:r>
         <w:rPr>
@@ -355,7 +355,7 @@
     </w:p>
     <w:p>
       <w:pPr>
-        <w:spacing w:before="0" w:after="240" w:line="276" w:lineRule="auto"/>
+        <w:spacing w:before="0" w:after="220" w:line="276" w:lineRule="auto"/>
       </w:pPr>
       <w:r>
         <w:rPr>
@@ -377,7 +377,7 @@
     </w:p>
     <w:p>
       <w:pPr>
-        <w:spacing w:before="0" w:after="240" w:line="276" w:lineRule="auto"/>
+        <w:spacing w:before="0" w:after="220" w:line="276" w:lineRule="auto"/>
       </w:pPr>
       <w:r>
         <w:rPr>
@@ -399,7 +399,7 @@
     </w:p>
     <w:p>
       <w:pPr>
-        <w:spacing w:before="0" w:after="240" w:line="276" w:lineRule="auto"/>
+        <w:spacing w:before="0" w:after="220" w:line="276" w:lineRule="auto"/>
       </w:pPr>
       <w:r>
         <w:rPr>
@@ -421,7 +421,7 @@
     </w:p>
     <w:p>
       <w:pPr>
-        <w:spacing w:before="0" w:after="240" w:line="276" w:lineRule="auto"/>
+        <w:spacing w:before="0" w:after="220" w:line="276" w:lineRule="auto"/>
       </w:pPr>
       <w:r>
         <w:rPr>
@@ -443,7 +443,7 @@
     </w:p>
     <w:p>
       <w:pPr>
-        <w:spacing w:before="0" w:after="160" w:line="276" w:lineRule="auto"/>
+        <w:spacing w:before="0" w:after="140" w:line="276" w:lineRule="auto"/>
       </w:pPr>
       <w:r>
         <w:rPr>
@@ -607,7 +607,7 @@
           <w:color w:val="0F172A"/>
           <w:sz w:val="16"/>
         </w:rPr>
-        <w:t>📞 +91-9850069600   •   ✉️ info@finesseoverseas.in   •   🌐 finesseoverseas.com</w:t>
+        <w:t>📞 +91-9850069600   •   ✉️ finesseoverseaseducation@gmail.com   •   🌐 finesseoverseas.com</w:t>
       </w:r>
     </w:p>
     <w:sectPr>

</xml_diff>